<commit_message>
Fix incorrect bullets, expand Android app description, polish Meijer section
Agent-Logs-Url: https://github.com/Hickmott2012/Resume/sessions/f7316aab-9f9b-42df-996e-d161d4fbd5d8

Co-authored-by: Hickmott2012 <11037509+Hickmott2012@users.noreply.github.com>
</commit_message>
<xml_diff>
--- a/Benjamin_Hickmott_Resume_2025.docx
+++ b/Benjamin_Hickmott_Resume_2025.docx
@@ -53,7 +53,7 @@
         <w:rPr>
           <w:sz w:val="21"/>
         </w:rPr>
-        <w:t>Results-driven Software Engineer with 5+ years of professional experience at Meijer Corporate delivering full-stack and mobile solutions at enterprise scale. Skilled in C#, ASP.NET, Blazor, Razor Pages, Android (Java/Kotlin), SQL (Teradata), and Microsoft Azure. Proven ability to design and deliver production applications including mobile apps, web portals, and media-management platforms. Strong academic foundation from Michigan State University with a history of Dean's List recognition and national honors society membership.</w:t>
+        <w:t>Results-driven Software Engineer with 5+ years of professional experience at Meijer Corporate delivering full-stack and mobile solutions at enterprise scale. Proficient in C#, ASP.NET, Blazor, Razor Pages, Android, SQL (Teradata), and Microsoft Azure. Proven track record designing and delivering production-grade applications spanning mobile, web, and cloud infrastructure. Strong academic foundation from Michigan State University with a history of Dean's List recognition and national honors society membership.</w:t>
       </w:r>
     </w:p>
     <w:p>
@@ -224,7 +224,7 @@
         <w:rPr>
           <w:sz w:val="21"/>
         </w:rPr>
-        <w:t>Developed and maintained multiple C# and ASP.NET applications supporting enterprise pharmacy checkout and point-of-sale systems.</w:t>
+        <w:t>Designed, developed, and maintained enterprise C# and ASP.NET applications supporting pharmacy checkout and retail point-of-sale operations.</w:t>
       </w:r>
     </w:p>
     <w:p>
@@ -237,7 +237,7 @@
         <w:rPr>
           <w:sz w:val="21"/>
         </w:rPr>
-        <w:t>Built a native Android mobile application that interfaces directly with the pharmacy checkout/sales system, incorporating barcode scanning (including camera-based scanning), signature capture, and photo capture.</w:t>
+        <w:t>Developed a native Android mobile application integrated with the pharmacy point-of-sale system, featuring camera-based and hardware barcode scanning, customer signature capture, photo capture, in-app PDF document preview, and HIPAA-compliant communication consent and disclosure presentation workflows.</w:t>
       </w:r>
     </w:p>
     <w:p>
@@ -250,7 +250,7 @@
         <w:rPr>
           <w:sz w:val="21"/>
         </w:rPr>
-        <w:t>Engineered 4 media-management systems distributed as commercial products to external partner companies.</w:t>
+        <w:t>Architected and delivered multiple Razor Pages and Blazor web applications supporting internal business workflows and operational tooling.</w:t>
       </w:r>
     </w:p>
     <w:p>
@@ -263,7 +263,7 @@
         <w:rPr>
           <w:sz w:val="21"/>
         </w:rPr>
-        <w:t>Designed and delivered numerous Razor Pages and Blazor web pages for internal business workflows.</w:t>
+        <w:t>Authored and optimized complex Teradata SQL queries to support data analysis, reporting, and business intelligence requirements.</w:t>
       </w:r>
     </w:p>
     <w:p>
@@ -276,7 +276,7 @@
         <w:rPr>
           <w:sz w:val="21"/>
         </w:rPr>
-        <w:t>Authored and optimized complex SQL queries using Teradata for data analysis and reporting.</w:t>
+        <w:t>Provisioned and configured Microsoft Azure infrastructure—including Function Apps, Web Apps, and Resource Groups—to support scalable application deployments.</w:t>
       </w:r>
     </w:p>
     <w:p>
@@ -289,7 +289,7 @@
         <w:rPr>
           <w:sz w:val="21"/>
         </w:rPr>
-        <w:t>Provisioned and configured Microsoft Azure resources including Function Apps, Web Apps, and Resource Groups to support application infrastructure.</w:t>
+        <w:t>Established and maintained CI/CD development and release pipelines in Azure DevOps, streamlining deployment workflows across multiple environments.</w:t>
       </w:r>
     </w:p>
     <w:p>
@@ -302,33 +302,7 @@
         <w:rPr>
           <w:sz w:val="21"/>
         </w:rPr>
-        <w:t>Designed and maintained CI/CD development and release pipelines in Azure DevOps.</w:t>
-      </w:r>
-    </w:p>
-    <w:p>
-      <w:pPr>
-        <w:pStyle w:val="ListBullet"/>
-        <w:spacing w:before="20" w:after="20"/>
-        <w:ind w:left="360"/>
-      </w:pPr>
-      <w:r>
-        <w:rPr>
-          <w:sz w:val="21"/>
-        </w:rPr>
-        <w:t>Managed Active Directory (AD) integration and REST API interactions across multiple projects.</w:t>
-      </w:r>
-    </w:p>
-    <w:p>
-      <w:pPr>
-        <w:pStyle w:val="ListBullet"/>
-        <w:spacing w:before="20" w:after="20"/>
-        <w:ind w:left="360"/>
-      </w:pPr>
-      <w:r>
-        <w:rPr>
-          <w:sz w:val="21"/>
-        </w:rPr>
-        <w:t>Completed an internal hackathon, delivering a barcode scanning solution using device camera integration.</w:t>
+        <w:t>Delivered a camera-based barcode scanning proof of concept during an internal company hackathon.</w:t>
       </w:r>
     </w:p>
     <w:p>

</xml_diff>

<commit_message>
Update skills, Android/hackathon bullets, enhance honors section
Agent-Logs-Url: https://github.com/Hickmott2012/Resume/sessions/fcc65691-7fa7-480c-a21c-5403789d8f71

Co-authored-by: Hickmott2012 <11037509+Hickmott2012@users.noreply.github.com>
</commit_message>
<xml_diff>
--- a/Benjamin_Hickmott_Resume_2025.docx
+++ b/Benjamin_Hickmott_Resume_2025.docx
@@ -86,13 +86,12 @@
           <w:b/>
           <w:sz w:val="21"/>
         </w:rPr>
-        <w:t xml:space="preserve">Languages: </w:t>
+        <w:t>Languages: C#, C++, Python, Java, Kotlin, Elixir, HTML, SQL, Visual Basic, CSS, JavaScript</w:t>
       </w:r>
       <w:r>
         <w:rPr>
           <w:sz w:val="21"/>
         </w:rPr>
-        <w:t>C#, C++, Python, Java (Android), HTML, SQL, Visual Basic, CSS, JavaScript</w:t>
       </w:r>
     </w:p>
     <w:p>
@@ -104,13 +103,12 @@
           <w:b/>
           <w:sz w:val="21"/>
         </w:rPr>
-        <w:t xml:space="preserve">Frameworks &amp; Platforms: </w:t>
+        <w:t>Frameworks &amp; Platforms: ASP.NET, Blazor, Razor Pages, Android SDK (Java/Kotlin), Android Jetpack, .NET, SignalR</w:t>
       </w:r>
       <w:r>
         <w:rPr>
           <w:sz w:val="21"/>
         </w:rPr>
-        <w:t>ASP.NET, Blazor, Razor Pages, Android SDK, .NET</w:t>
       </w:r>
     </w:p>
     <w:p>
@@ -122,13 +120,12 @@
           <w:b/>
           <w:sz w:val="21"/>
         </w:rPr>
-        <w:t xml:space="preserve">Cloud &amp; DevOps: </w:t>
+        <w:t>Cloud &amp; DevOps: Microsoft Azure (Function Apps, Web Apps, Resource Groups, Storage Accounts, Cosmos DB, Blob Storage), Azure DevOps, CI/CD Release Pipelines</w:t>
       </w:r>
       <w:r>
         <w:rPr>
           <w:sz w:val="21"/>
         </w:rPr>
-        <w:t>Microsoft Azure (Function Apps, Web Apps, Resource Groups), Azure DevOps, CI/CD Release Pipelines</w:t>
       </w:r>
     </w:p>
     <w:p>
@@ -158,13 +155,12 @@
           <w:b/>
           <w:sz w:val="21"/>
         </w:rPr>
-        <w:t xml:space="preserve">Tools &amp; Other: </w:t>
+        <w:t>Tools &amp; Other: Visual Studio, Android Studio, Azure Storage Explorer, Git, Azure AD, Kafka, Offset Explorer, Barcode Scanning, Signature Capture, REST API Integration, Photoshop, Unity</w:t>
       </w:r>
       <w:r>
         <w:rPr>
           <w:sz w:val="21"/>
         </w:rPr>
-        <w:t>Visual Studio, Git, Azure AD, Barcode Scanning, Signature Capture, REST API Integration, Photoshop, Unity</w:t>
       </w:r>
     </w:p>
     <w:p>
@@ -237,7 +233,7 @@
         <w:rPr>
           <w:sz w:val="21"/>
         </w:rPr>
-        <w:t>Developed a native Android mobile application integrated with the pharmacy point-of-sale system, featuring camera-based and hardware barcode scanning, customer signature capture, photo capture, in-app PDF document preview, and HIPAA-compliant communication consent and disclosure presentation workflows.</w:t>
+        <w:t>Developed a native Android mobile application integrated with the pharmacy point-of-sale system, featuring hardware barcode scanning, customer signature capture, in-app PDF document preview, and HIPAA-compliant communication consent and disclosure presentation workflows.</w:t>
       </w:r>
     </w:p>
     <w:p>
@@ -290,19 +286,6 @@
           <w:sz w:val="21"/>
         </w:rPr>
         <w:t>Established and maintained CI/CD development and release pipelines in Azure DevOps, streamlining deployment workflows across multiple environments.</w:t>
-      </w:r>
-    </w:p>
-    <w:p>
-      <w:pPr>
-        <w:pStyle w:val="ListBullet"/>
-        <w:spacing w:before="20" w:after="20"/>
-        <w:ind w:left="360"/>
-      </w:pPr>
-      <w:r>
-        <w:rPr>
-          <w:sz w:val="21"/>
-        </w:rPr>
-        <w:t>Delivered a camera-based barcode scanning proof of concept during an internal company hackathon.</w:t>
       </w:r>
     </w:p>
     <w:p>
@@ -658,7 +641,7 @@
         <w:rPr>
           <w:sz w:val="21"/>
         </w:rPr>
-        <w:t>Phi Theta Kappa Honors Society Member</w:t>
+        <w:t>Phi Theta Kappa International Honor Society Member</w:t>
       </w:r>
     </w:p>
     <w:p>
@@ -671,7 +654,7 @@
         <w:rPr>
           <w:sz w:val="21"/>
         </w:rPr>
-        <w:t>National Honors Society Member (2012–2016)</w:t>
+        <w:t>National Honor Society Member (2012–2016)</w:t>
       </w:r>
     </w:p>
     <w:p>
@@ -736,7 +719,20 @@
         <w:rPr>
           <w:sz w:val="21"/>
         </w:rPr>
-        <w:t>TechSmith Capstone Team Project participant – Michigan State University</w:t>
+        <w:t>TechSmith-Sponsored Capstone Team Project Participant – Michigan State University</w:t>
+      </w:r>
+    </w:p>
+    <w:p>
+      <w:pPr>
+        <w:pStyle w:val="ListBullet"/>
+        <w:spacing w:before="20" w:after="20"/>
+        <w:ind w:left="360"/>
+      </w:pPr>
+      <w:r>
+        <w:rPr>
+          <w:sz w:val="21"/>
+        </w:rPr>
+        <w:t xml:space="preserve">Delivered a proof of concept at an internal company hackathon incorporating camera-based barcode scanning, photo capture, and real-time image filter and enhancement capabilities.</w:t>
       </w:r>
     </w:p>
     <w:sectPr>

</xml_diff>